<commit_message>
Update technology curriculum materials
</commit_message>
<xml_diff>
--- a/plans/6th Grade Technology/Monthly Planning/2nd Trimester/6° Technology - August.docx
+++ b/plans/6th Grade Technology/Monthly Planning/2nd Trimester/6° Technology - August.docx
@@ -336,68 +336,35 @@
             </w:pPr>
             <w:r>
               <w:rPr>
+                <w:rFonts w:ascii="Arial" w:hAnsi="Arial"/>
                 <w:b/>
-                <w:bCs/>
-                <w:sz w:val="24"/>
-                <w:szCs w:val="24"/>
+                <w:sz w:val="24"/>
               </w:rPr>
               <w:t>Competences:</w:t>
             </w:r>
             <w:r>
               <w:rPr>
-                <w:b/>
-                <w:bCs/>
-                <w:sz w:val="24"/>
-                <w:szCs w:val="24"/>
+                <w:rFonts w:ascii="Arial" w:hAnsi="Arial"/>
+                <w:sz w:val="24"/>
               </w:rPr>
               <w:br/>
-            </w:r>
-            <w:r>
-              <w:rPr>
-                <w:sz w:val="24"/>
-                <w:szCs w:val="24"/>
-              </w:rPr>
-              <w:t>Use mBot Knowledge Cards to review movement, output, sensor, and debugging tasks.</w:t>
-            </w:r>
-            <w:r>
-              <w:rPr>
-                <w:sz w:val="24"/>
-                <w:szCs w:val="24"/>
+              <w:t>Combine line-sensor input, ultrasonic distance checks, conditions, and movement responses in a teacher-assigned rescue route.</w:t>
+            </w:r>
+            <w:r>
+              <w:rPr>
+                <w:rFonts w:ascii="Arial" w:hAnsi="Arial"/>
+                <w:sz w:val="24"/>
               </w:rPr>
               <w:br/>
-              <w:t>Combine movement with one output or sensor in a controlled mBot STEM Challenge Project.</w:t>
-            </w:r>
-            <w:r>
-              <w:rPr>
-                <w:sz w:val="24"/>
-                <w:szCs w:val="24"/>
+              <w:t>Modify, test, debug, and demonstrate an assigned mBlock project.</w:t>
+            </w:r>
+            <w:r>
+              <w:rPr>
+                <w:rFonts w:ascii="Arial" w:hAnsi="Arial"/>
+                <w:sz w:val="24"/>
               </w:rPr>
               <w:br/>
-              <w:t>Demonstrate, explain, and document a robot program using clear testing and improvement evidence.</w:t>
-            </w:r>
-            <w:r>
-              <w:rPr>
-                <w:sz w:val="24"/>
-                <w:szCs w:val="24"/>
-              </w:rPr>
-              <w:br/>
-              <w:t xml:space="preserve">Leave </w:t>
-            </w:r>
-            <w:proofErr w:type="spellStart"/>
-            <w:r>
-              <w:rPr>
-                <w:sz w:val="24"/>
-                <w:szCs w:val="24"/>
-              </w:rPr>
-              <w:t>mBots</w:t>
-            </w:r>
-            <w:proofErr w:type="spellEnd"/>
-            <w:r>
-              <w:rPr>
-                <w:sz w:val="24"/>
-                <w:szCs w:val="24"/>
-              </w:rPr>
-              <w:t xml:space="preserve"> ready with numbered kits, saved code/screenshot, challenge sheet, route/test data, and sensor/output notes.</w:t>
+              <w:t>Explain the robot's line-following, obstacle, branch, and stop logic in English.</w:t>
             </w:r>
           </w:p>
         </w:tc>
@@ -418,44 +385,35 @@
             </w:pPr>
             <w:r>
               <w:rPr>
+                <w:rFonts w:ascii="Arial" w:hAnsi="Arial"/>
                 <w:b/>
-                <w:bCs/>
-                <w:sz w:val="24"/>
-                <w:szCs w:val="24"/>
+                <w:sz w:val="24"/>
               </w:rPr>
               <w:t>Learning Objectives:</w:t>
             </w:r>
             <w:r>
               <w:rPr>
-                <w:sz w:val="24"/>
-                <w:szCs w:val="24"/>
+                <w:rFonts w:ascii="Arial" w:hAnsi="Arial"/>
+                <w:sz w:val="24"/>
               </w:rPr>
               <w:br/>
-              <w:t>Read and apply selected mBot Knowledge Cards as formative practice stations.</w:t>
-            </w:r>
-            <w:r>
-              <w:rPr>
-                <w:sz w:val="24"/>
-                <w:szCs w:val="24"/>
+              <w:t>Review and practice the line-following corrections and ultrasonic branch decisions required by the assigned rescue route.</w:t>
+            </w:r>
+            <w:r>
+              <w:rPr>
+                <w:rFonts w:ascii="Arial" w:hAnsi="Arial"/>
+                <w:sz w:val="24"/>
               </w:rPr>
               <w:br/>
-              <w:t>Plan, build, and test a realistic mBot STEM challenge with a goal and success rule.</w:t>
-            </w:r>
-            <w:r>
-              <w:rPr>
-                <w:sz w:val="24"/>
-                <w:szCs w:val="24"/>
+              <w:t>Modify and test the assigned Rescue Robot project in controlled stages.</w:t>
+            </w:r>
+            <w:r>
+              <w:rPr>
+                <w:rFonts w:ascii="Arial" w:hAnsi="Arial"/>
+                <w:sz w:val="24"/>
               </w:rPr>
               <w:br/>
-              <w:t>Explain the robot action, one card, block, or part used, and one improvement made after testing.</w:t>
-            </w:r>
-            <w:r>
-              <w:rPr>
-                <w:sz w:val="24"/>
-                <w:szCs w:val="24"/>
-              </w:rPr>
-              <w:br/>
-              <w:t>Prepare robot readiness evidence for the first weeks of Trimester 3.</w:t>
+              <w:t>Explain the sensor checks, conditions, branches, and final stop behavior.</w:t>
             </w:r>
           </w:p>
         </w:tc>
@@ -476,62 +434,36 @@
             </w:pPr>
             <w:r>
               <w:rPr>
+                <w:rFonts w:ascii="Arial" w:hAnsi="Arial"/>
                 <w:b/>
-                <w:bCs/>
-                <w:sz w:val="24"/>
-                <w:szCs w:val="24"/>
+                <w:sz w:val="24"/>
               </w:rPr>
               <w:t>Learning Outcomes:</w:t>
             </w:r>
             <w:r>
               <w:rPr>
-                <w:sz w:val="24"/>
-                <w:szCs w:val="24"/>
+                <w:rFonts w:ascii="Arial" w:hAnsi="Arial"/>
+                <w:sz w:val="24"/>
               </w:rPr>
               <w:br/>
-              <w:t xml:space="preserve">Complete </w:t>
-            </w:r>
-            <w:proofErr w:type="spellStart"/>
-            <w:r>
-              <w:rPr>
-                <w:sz w:val="24"/>
-                <w:szCs w:val="24"/>
-              </w:rPr>
-              <w:t>mBot</w:t>
-            </w:r>
-            <w:proofErr w:type="spellEnd"/>
-            <w:r>
-              <w:rPr>
-                <w:sz w:val="24"/>
-                <w:szCs w:val="24"/>
-              </w:rPr>
-              <w:t xml:space="preserve"> card practice with recorded robot action and explanation as formative preparation.</w:t>
-            </w:r>
-            <w:r>
-              <w:rPr>
-                <w:sz w:val="24"/>
-                <w:szCs w:val="24"/>
+              <w:t>Complete guided line-following and obstacle-decision practice.</w:t>
+            </w:r>
+            <w:r>
+              <w:rPr>
+                <w:rFonts w:ascii="Arial" w:hAnsi="Arial"/>
+                <w:sz w:val="24"/>
               </w:rPr>
               <w:br/>
-              <w:t>Submit a final STEM challenge plan and station notes showing testing and debugging.</w:t>
-            </w:r>
-            <w:r>
-              <w:rPr>
-                <w:sz w:val="24"/>
-                <w:szCs w:val="24"/>
+              <w:t>Test the assigned rescue route, record one problem and correction, and prepare an English explanation.</w:t>
+            </w:r>
+            <w:r>
+              <w:rPr>
+                <w:rFonts w:ascii="Arial" w:hAnsi="Arial"/>
+                <w:sz w:val="24"/>
               </w:rPr>
               <w:br/>
-              <w:t>Demonstrate a final mBot STEM challenge and complete a reflection about goal, action, improvement, and readiness for the next project.</w:t>
-            </w:r>
-          </w:p>
-          <w:p>
-            <w:pPr>
-              <w:spacing w:line="480" w:lineRule="auto"/>
-              <w:rPr>
-                <w:sz w:val="24"/>
-                <w:szCs w:val="24"/>
-              </w:rPr>
-            </w:pPr>
+              <w:t>Complete Summative #5 by demonstrating, saving, and submitting the Rescue Robot project and returning the numbered kit correctly.</w:t>
+            </w:r>
           </w:p>
         </w:tc>
       </w:tr>
@@ -570,22 +502,11 @@
             </w:pPr>
             <w:r>
               <w:rPr>
+                <w:rFonts w:ascii="Arial" w:hAnsi="Arial"/>
                 <w:b/>
-                <w:bCs/>
-                <w:sz w:val="24"/>
-                <w:szCs w:val="24"/>
-              </w:rPr>
-              <w:lastRenderedPageBreak/>
-              <w:t xml:space="preserve">6A, 6B, 6C day – 45min – August - Week </w:t>
-            </w:r>
-            <w:r>
-              <w:rPr>
-                <w:b/>
-                <w:bCs/>
-                <w:sz w:val="24"/>
-                <w:szCs w:val="24"/>
-              </w:rPr>
-              <w:t>9</w:t>
+                <w:sz w:val="24"/>
+              </w:rPr>
+              <w:t>6A, 6B, 6C day – 45min – August - Week 10</w:t>
             </w:r>
           </w:p>
         </w:tc>
@@ -612,21 +533,11 @@
             </w:pPr>
             <w:r>
               <w:rPr>
+                <w:rFonts w:ascii="Arial" w:hAnsi="Arial"/>
                 <w:b/>
-                <w:bCs/>
-                <w:sz w:val="24"/>
-                <w:szCs w:val="24"/>
-              </w:rPr>
-              <w:t xml:space="preserve">6A, 6B, 6C day – 90 min – August - Week </w:t>
-            </w:r>
-            <w:r>
-              <w:rPr>
-                <w:b/>
-                <w:bCs/>
-                <w:sz w:val="24"/>
-                <w:szCs w:val="24"/>
-              </w:rPr>
-              <w:t>9</w:t>
+                <w:sz w:val="24"/>
+              </w:rPr>
+              <w:t>6A, 6B, 6C day – 90 min – August - Week 10</w:t>
             </w:r>
           </w:p>
         </w:tc>
@@ -644,7 +555,7 @@
           </w:tcPr>
           <w:p>
             <w:pPr>
-              <w:spacing w:line="360" w:lineRule="auto"/>
+              <w:spacing w:line="300" w:lineRule="auto" w:before="0" w:after="0"/>
               <w:rPr>
                 <w:sz w:val="24"/>
                 <w:szCs w:val="24"/>
@@ -652,222 +563,113 @@
             </w:pPr>
             <w:r>
               <w:rPr>
+                <w:rFonts w:ascii="Arial" w:hAnsi="Arial"/>
                 <w:b/>
-                <w:bCs/>
-                <w:sz w:val="24"/>
-                <w:szCs w:val="24"/>
+                <w:sz w:val="24"/>
               </w:rPr>
               <w:t>Topic:</w:t>
             </w:r>
             <w:r>
               <w:rPr>
+                <w:rFonts w:ascii="Arial" w:hAnsi="Arial"/>
+                <w:b w:val="0"/>
+                <w:sz w:val="24"/>
+              </w:rPr>
+              <w:t xml:space="preserve"> Line-following logic review</w:t>
+            </w:r>
+            <w:r>
+              <w:rPr>
+                <w:rFonts w:ascii="Arial" w:hAnsi="Arial"/>
                 <w:b/>
-                <w:bCs/>
-                <w:sz w:val="24"/>
-                <w:szCs w:val="24"/>
-              </w:rPr>
-              <w:t xml:space="preserve"> </w:t>
-            </w:r>
-            <w:r>
-              <w:rPr>
-                <w:sz w:val="24"/>
-                <w:szCs w:val="24"/>
-              </w:rPr>
-              <w:t>Knowledge Cards review</w:t>
-            </w:r>
-            <w:r>
-              <w:rPr>
-                <w:b/>
-                <w:bCs/>
-                <w:sz w:val="24"/>
-                <w:szCs w:val="24"/>
-              </w:rPr>
-              <w:br/>
-            </w:r>
-            <w:r>
-              <w:rPr>
-                <w:sz w:val="24"/>
-                <w:szCs w:val="24"/>
-                <w:b/>
-                <w:bCs/>
-              </w:rPr>
-              <w:t>Class Objective:</w:t>
-            </w:r>
-            <w:r>
-              <w:rPr>
-                <w:sz w:val="24"/>
-                <w:szCs w:val="24"/>
-              </w:rPr>
-              <w:br/>
-              <w:t>Practice reading one mBot Knowledge Card and predicting what robot action it helps create.</w:t>
-            </w:r>
-            <w:r>
-              <w:rPr>
-                <w:sz w:val="24"/>
-                <w:szCs w:val="24"/>
+                <w:sz w:val="24"/>
               </w:rPr>
               <w:br/>
               <w:br/>
-            </w:r>
-            <w:r>
-              <w:rPr>
+              <w:t>Class Objective:</w:t>
+            </w:r>
+            <w:r>
+              <w:rPr>
+                <w:rFonts w:ascii="Arial" w:hAnsi="Arial"/>
+                <w:b w:val="0"/>
+                <w:sz w:val="24"/>
+              </w:rPr>
+              <w:br/>
+              <w:t>Identify the loop, line-sensor input, forward movement, corrections, and lost-line response in the assigned code.</w:t>
+            </w:r>
+            <w:r>
+              <w:rPr>
+                <w:rFonts w:ascii="Arial" w:hAnsi="Arial"/>
                 <w:b/>
-                <w:bCs/>
-                <w:sz w:val="24"/>
-                <w:szCs w:val="24"/>
-              </w:rPr>
+                <w:sz w:val="24"/>
+              </w:rPr>
+              <w:br/>
               <w:br/>
               <w:t>Pre-activities</w:t>
             </w:r>
             <w:r>
               <w:rPr>
+                <w:rFonts w:ascii="Arial" w:hAnsi="Arial"/>
+                <w:b w:val="0"/>
+                <w:sz w:val="24"/>
+              </w:rPr>
+              <w:br/>
+              <w:t>Review the Summative #5 task and teacher-prepared rescue route.</w:t>
+            </w:r>
+            <w:r>
+              <w:rPr>
+                <w:rFonts w:ascii="Arial" w:hAnsi="Arial"/>
+                <w:b w:val="0"/>
+                <w:sz w:val="24"/>
+              </w:rPr>
+              <w:br/>
+              <w:t>Review August Week 1 vocabulary: line sensor, correction, loop, forward, left, right, and lost line.</w:t>
+            </w:r>
+            <w:r>
+              <w:rPr>
+                <w:rFonts w:ascii="Arial" w:hAnsi="Arial"/>
                 <w:b/>
-                <w:bCs/>
-                <w:sz w:val="24"/>
-                <w:szCs w:val="24"/>
+                <w:sz w:val="24"/>
               </w:rPr>
               <w:br/>
-            </w:r>
-            <w:r>
-              <w:rPr>
-                <w:sz w:val="24"/>
-                <w:szCs w:val="24"/>
-              </w:rPr>
-              <w:t>Answer the warm-up question: Which mBot card helped you the most?</w:t>
-            </w:r>
-            <w:r>
-              <w:rPr>
-                <w:sz w:val="24"/>
-                <w:szCs w:val="24"/>
-              </w:rPr>
-              <w:br/>
-              <w:t>Review August Week 1 practice vocabulary (part 1).</w:t>
-            </w:r>
-            <w:r>
-              <w:rPr>
-                <w:sz w:val="24"/>
-                <w:szCs w:val="24"/>
-              </w:rPr>
-              <w:br/>
-              <w:t>movement: changing position</w:t>
-            </w:r>
-            <w:r>
-              <w:rPr>
-                <w:sz w:val="24"/>
-                <w:szCs w:val="24"/>
-              </w:rPr>
-              <w:br/>
-              <w:t>output: what a device shows or does</w:t>
-            </w:r>
-            <w:r>
-              <w:rPr>
-                <w:sz w:val="24"/>
-                <w:szCs w:val="24"/>
-              </w:rPr>
-              <w:br/>
-              <w:t>sensor: part that detects something</w:t>
-            </w:r>
-            <w:r>
-              <w:rPr>
-                <w:sz w:val="24"/>
-                <w:szCs w:val="24"/>
-              </w:rPr>
-              <w:br/>
-              <w:t>debug: find and fix a problem</w:t>
-            </w:r>
-            <w:r>
-              <w:rPr>
-                <w:sz w:val="24"/>
-                <w:szCs w:val="24"/>
-              </w:rPr>
-              <w:br/>
-              <w:t>Review the assigned mBot Knowledge Card Part 1.</w:t>
-            </w:r>
-            <w:r>
-              <w:rPr>
-                <w:b/>
-                <w:bCs/>
-                <w:sz w:val="24"/>
-                <w:szCs w:val="24"/>
-              </w:rPr>
-              <w:br/>
-            </w:r>
-            <w:r>
-              <w:rPr>
-                <w:b/>
-                <w:bCs/>
-                <w:sz w:val="24"/>
-                <w:szCs w:val="24"/>
-              </w:rPr>
               <w:br/>
               <w:t>While activities</w:t>
             </w:r>
             <w:r>
               <w:rPr>
+                <w:rFonts w:ascii="Arial" w:hAnsi="Arial"/>
+                <w:b w:val="0"/>
+                <w:sz w:val="24"/>
+              </w:rPr>
+              <w:br/>
+              <w:t>Trace the assigned line-following code using three sample sensor readings.</w:t>
+            </w:r>
+            <w:r>
+              <w:rPr>
+                <w:rFonts w:ascii="Arial" w:hAnsi="Arial"/>
+                <w:b w:val="0"/>
+                <w:sz w:val="24"/>
+              </w:rPr>
+              <w:br/>
+              <w:t>Match each reading to forward, left correction, right correction, or lost-line response.</w:t>
+            </w:r>
+            <w:r>
+              <w:rPr>
+                <w:rFonts w:ascii="Arial" w:hAnsi="Arial"/>
                 <w:b/>
-                <w:bCs/>
-                <w:sz w:val="24"/>
-                <w:szCs w:val="24"/>
+                <w:sz w:val="24"/>
               </w:rPr>
               <w:br/>
-            </w:r>
-            <w:r>
-              <w:rPr>
-                <w:sz w:val="24"/>
-                <w:szCs w:val="24"/>
-              </w:rPr>
-              <w:t>Practice reading one mBot Knowledge Card and predicting what robot action it helps create.</w:t>
-            </w:r>
-            <w:r>
-              <w:rPr>
-                <w:sz w:val="24"/>
-                <w:szCs w:val="24"/>
-              </w:rPr>
-              <w:br/>
-              <w:t>Review how the card could support a STEM challenge.</w:t>
-            </w:r>
-            <w:r>
-              <w:rPr>
-                <w:b/>
-                <w:bCs/>
-                <w:sz w:val="24"/>
-                <w:szCs w:val="24"/>
-              </w:rPr>
-              <w:br/>
-            </w:r>
-            <w:r>
-              <w:rPr>
-                <w:b/>
-                <w:bCs/>
-                <w:sz w:val="24"/>
-                <w:szCs w:val="24"/>
-              </w:rPr>
               <w:br/>
               <w:t>Post activities</w:t>
             </w:r>
             <w:r>
               <w:rPr>
-                <w:b/>
-                <w:bCs/>
-                <w:sz w:val="24"/>
-                <w:szCs w:val="24"/>
+                <w:rFonts w:ascii="Arial" w:hAnsi="Arial"/>
+                <w:b w:val="0"/>
+                <w:sz w:val="24"/>
               </w:rPr>
               <w:br/>
-            </w:r>
-            <w:r>
-              <w:rPr>
-                <w:sz w:val="24"/>
-                <w:szCs w:val="24"/>
-              </w:rPr>
-              <w:t>Share the robot action from the assigned card.</w:t>
-            </w:r>
-            <w:r>
-              <w:rPr>
-                <w:sz w:val="24"/>
-                <w:szCs w:val="24"/>
-              </w:rPr>
-              <w:br/>
-              <w:t>Write one way the card could help in the final challenge.</w:t>
+              <w:t>Complete a four-item line-following exit check.</w:t>
             </w:r>
           </w:p>
         </w:tc>
@@ -883,7 +685,7 @@
           </w:tcPr>
           <w:p>
             <w:pPr>
-              <w:spacing w:line="360" w:lineRule="auto"/>
+              <w:spacing w:line="300" w:lineRule="auto" w:before="0" w:after="0"/>
               <w:rPr>
                 <w:sz w:val="24"/>
                 <w:szCs w:val="24"/>
@@ -891,261 +693,123 @@
             </w:pPr>
             <w:r>
               <w:rPr>
+                <w:rFonts w:ascii="Arial" w:hAnsi="Arial"/>
                 <w:b/>
-                <w:bCs/>
-                <w:sz w:val="24"/>
-                <w:szCs w:val="24"/>
-              </w:rPr>
-              <w:t xml:space="preserve">Topic: </w:t>
-            </w:r>
-            <w:r>
-              <w:rPr>
-                <w:sz w:val="24"/>
-                <w:szCs w:val="24"/>
-              </w:rPr>
-              <w:t xml:space="preserve">Plan the </w:t>
-            </w:r>
-            <w:proofErr w:type="spellStart"/>
-            <w:r>
-              <w:rPr>
-                <w:sz w:val="24"/>
-                <w:szCs w:val="24"/>
-              </w:rPr>
-              <w:t>mBot</w:t>
-            </w:r>
-            <w:proofErr w:type="spellEnd"/>
-            <w:r>
-              <w:rPr>
-                <w:sz w:val="24"/>
-                <w:szCs w:val="24"/>
-              </w:rPr>
-              <w:t xml:space="preserve"> STEM challenge</w:t>
-            </w:r>
-            <w:r>
-              <w:rPr>
+                <w:sz w:val="24"/>
+              </w:rPr>
+              <w:t>Topic:</w:t>
+            </w:r>
+            <w:r>
+              <w:rPr>
+                <w:rFonts w:ascii="Arial" w:hAnsi="Arial"/>
+                <w:b w:val="0"/>
+                <w:sz w:val="24"/>
+              </w:rPr>
+              <w:t xml:space="preserve"> Guided line-following practice</w:t>
+            </w:r>
+            <w:r>
+              <w:rPr>
+                <w:rFonts w:ascii="Arial" w:hAnsi="Arial"/>
                 <w:b/>
-                <w:bCs/>
-                <w:sz w:val="24"/>
-                <w:szCs w:val="24"/>
-              </w:rPr>
-              <w:br/>
-            </w:r>
-            <w:r>
-              <w:rPr>
-                <w:sz w:val="24"/>
-                <w:szCs w:val="24"/>
-                <w:b/>
-                <w:bCs/>
-              </w:rPr>
-              <w:t>Class Objective:</w:t>
-            </w:r>
-            <w:r>
-              <w:rPr>
-                <w:sz w:val="24"/>
-                <w:szCs w:val="24"/>
-              </w:rPr>
-              <w:br/>
-              <w:t>Plan the mBot STEM challenge.</w:t>
-            </w:r>
-            <w:r>
-              <w:rPr>
-                <w:sz w:val="24"/>
-                <w:szCs w:val="24"/>
+                <w:sz w:val="24"/>
               </w:rPr>
               <w:br/>
               <w:br/>
-            </w:r>
-            <w:r>
-              <w:rPr>
+              <w:t>Class Objective:</w:t>
+            </w:r>
+            <w:r>
+              <w:rPr>
+                <w:rFonts w:ascii="Arial" w:hAnsi="Arial"/>
+                <w:b w:val="0"/>
+                <w:sz w:val="24"/>
+              </w:rPr>
+              <w:br/>
+              <w:t>Test and correct the line-following section of the assigned Rescue Robot project.</w:t>
+            </w:r>
+            <w:r>
+              <w:rPr>
+                <w:rFonts w:ascii="Arial" w:hAnsi="Arial"/>
                 <w:b/>
-                <w:bCs/>
-                <w:sz w:val="24"/>
-                <w:szCs w:val="24"/>
-              </w:rPr>
+                <w:sz w:val="24"/>
+              </w:rPr>
+              <w:br/>
               <w:br/>
               <w:t>Pre-activities</w:t>
             </w:r>
             <w:r>
               <w:rPr>
+                <w:rFonts w:ascii="Arial" w:hAnsi="Arial"/>
+                <w:b w:val="0"/>
+                <w:sz w:val="24"/>
+              </w:rPr>
+              <w:br/>
+              <w:t>Collect the numbered mBot kit and open the assigned starter project.</w:t>
+            </w:r>
+            <w:r>
+              <w:rPr>
+                <w:rFonts w:ascii="Arial" w:hAnsi="Arial"/>
+                <w:b w:val="0"/>
+                <w:sz w:val="24"/>
+              </w:rPr>
+              <w:br/>
+              <w:t>Review the line-following checklist.</w:t>
+            </w:r>
+            <w:r>
+              <w:rPr>
+                <w:rFonts w:ascii="Arial" w:hAnsi="Arial"/>
                 <w:b/>
-                <w:bCs/>
-                <w:sz w:val="24"/>
-                <w:szCs w:val="24"/>
+                <w:sz w:val="24"/>
               </w:rPr>
               <w:br/>
-            </w:r>
-            <w:r>
-              <w:rPr>
-                <w:sz w:val="24"/>
-                <w:szCs w:val="24"/>
-              </w:rPr>
-              <w:t>Answer the warm-up question: What task can your robot complete successfully?</w:t>
-            </w:r>
-            <w:r>
-              <w:rPr>
-                <w:sz w:val="24"/>
-                <w:szCs w:val="24"/>
-              </w:rPr>
-              <w:br/>
-              <w:t>Review August Week 2 practice vocabulary.</w:t>
-            </w:r>
-            <w:r>
-              <w:rPr>
-                <w:sz w:val="24"/>
-                <w:szCs w:val="24"/>
-              </w:rPr>
-              <w:br/>
-              <w:t>goal: what you are trying to do</w:t>
-            </w:r>
-            <w:r>
-              <w:rPr>
-                <w:sz w:val="24"/>
-                <w:szCs w:val="24"/>
-              </w:rPr>
-              <w:br/>
-              <w:t>success rule: rule that says the task worked</w:t>
-            </w:r>
-            <w:r>
-              <w:rPr>
-                <w:sz w:val="24"/>
-                <w:szCs w:val="24"/>
-              </w:rPr>
-              <w:br/>
-              <w:t>test area: space used for trying work</w:t>
-            </w:r>
-            <w:r>
-              <w:rPr>
-                <w:sz w:val="24"/>
-                <w:szCs w:val="24"/>
-              </w:rPr>
-              <w:br/>
-              <w:t>Choose one challenge type: path, obstacle, signal, or line/sensor task.</w:t>
-            </w:r>
-            <w:r>
-              <w:rPr>
-                <w:sz w:val="24"/>
-                <w:szCs w:val="24"/>
-              </w:rPr>
-              <w:br/>
-            </w:r>
-            <w:r>
-              <w:rPr>
-                <w:b/>
-                <w:bCs/>
-                <w:sz w:val="24"/>
-                <w:szCs w:val="24"/>
-              </w:rPr>
               <w:br/>
               <w:t>While activities</w:t>
             </w:r>
             <w:r>
               <w:rPr>
+                <w:rFonts w:ascii="Arial" w:hAnsi="Arial"/>
+                <w:b w:val="0"/>
+                <w:sz w:val="24"/>
+              </w:rPr>
+              <w:br/>
+              <w:t>Run the assigned project on the teacher-prepared line route.</w:t>
+            </w:r>
+            <w:r>
+              <w:rPr>
+                <w:rFonts w:ascii="Arial" w:hAnsi="Arial"/>
+                <w:b w:val="0"/>
+                <w:sz w:val="24"/>
+              </w:rPr>
+              <w:br/>
+              <w:t>Test forward movement, left correction, right correction, and lost-line response.</w:t>
+            </w:r>
+            <w:r>
+              <w:rPr>
+                <w:rFonts w:ascii="Arial" w:hAnsi="Arial"/>
+                <w:b w:val="0"/>
+                <w:sz w:val="24"/>
+              </w:rPr>
+              <w:br/>
+              <w:t>Change only teacher-approved values and record one problem and correction.</w:t>
+            </w:r>
+            <w:r>
+              <w:rPr>
+                <w:rFonts w:ascii="Arial" w:hAnsi="Arial"/>
                 <w:b/>
-                <w:bCs/>
-                <w:sz w:val="24"/>
-                <w:szCs w:val="24"/>
+                <w:sz w:val="24"/>
               </w:rPr>
               <w:br/>
-            </w:r>
-            <w:r>
-              <w:rPr>
-                <w:sz w:val="24"/>
-                <w:szCs w:val="24"/>
-              </w:rPr>
-              <w:t xml:space="preserve">Plan the </w:t>
-            </w:r>
-            <w:proofErr w:type="spellStart"/>
-            <w:r>
-              <w:rPr>
-                <w:sz w:val="24"/>
-                <w:szCs w:val="24"/>
-              </w:rPr>
-              <w:t>mBot</w:t>
-            </w:r>
-            <w:proofErr w:type="spellEnd"/>
-            <w:r>
-              <w:rPr>
-                <w:sz w:val="24"/>
-                <w:szCs w:val="24"/>
-              </w:rPr>
-              <w:t xml:space="preserve"> STEM challenge.</w:t>
-            </w:r>
-            <w:r>
-              <w:rPr>
-                <w:sz w:val="24"/>
-                <w:szCs w:val="24"/>
-              </w:rPr>
-              <w:br/>
-              <w:t>Write the goal and success rule.</w:t>
-            </w:r>
-            <w:r>
-              <w:rPr>
-                <w:sz w:val="24"/>
-                <w:szCs w:val="24"/>
-              </w:rPr>
-              <w:br/>
-              <w:t>List the cards, blocks, or parts you will use.</w:t>
-            </w:r>
-            <w:r>
-              <w:rPr>
-                <w:sz w:val="24"/>
-                <w:szCs w:val="24"/>
-              </w:rPr>
-              <w:br/>
-              <w:t>Check that the plan can be completed in class time.</w:t>
-            </w:r>
-            <w:r>
-              <w:rPr>
-                <w:b/>
-                <w:bCs/>
-                <w:sz w:val="24"/>
-                <w:szCs w:val="24"/>
-              </w:rPr>
-              <w:br/>
-            </w:r>
-            <w:r>
-              <w:rPr>
-                <w:b/>
-                <w:bCs/>
-                <w:sz w:val="24"/>
-                <w:szCs w:val="24"/>
-              </w:rPr>
               <w:br/>
               <w:t>Post activities</w:t>
             </w:r>
             <w:r>
               <w:rPr>
-                <w:b/>
-                <w:bCs/>
-                <w:sz w:val="24"/>
-                <w:szCs w:val="24"/>
+                <w:rFonts w:ascii="Arial" w:hAnsi="Arial"/>
+                <w:b w:val="0"/>
+                <w:sz w:val="24"/>
               </w:rPr>
               <w:br/>
-            </w:r>
-            <w:r>
-              <w:rPr>
-                <w:sz w:val="24"/>
-                <w:szCs w:val="24"/>
-              </w:rPr>
-              <w:t>Submit the STEM challenge plan.</w:t>
-            </w:r>
-            <w:r>
-              <w:rPr>
-                <w:sz w:val="24"/>
-                <w:szCs w:val="24"/>
-              </w:rPr>
-              <w:br/>
-              <w:t>Explain your success rule to a partner.</w:t>
-            </w:r>
-          </w:p>
-          <w:p>
-            <w:pPr>
-              <w:spacing w:line="360" w:lineRule="auto"/>
-              <w:rPr>
-                <w:sz w:val="24"/>
-                <w:szCs w:val="24"/>
-              </w:rPr>
-            </w:pPr>
+              <w:t>Demonstrate stable line following before beginning obstacle logic.</w:t>
+            </w:r>
           </w:p>
         </w:tc>
       </w:tr>
@@ -1233,31 +897,11 @@
             </w:pPr>
             <w:r>
               <w:rPr>
+                <w:rFonts w:ascii="Arial" w:hAnsi="Arial"/>
                 <w:b/>
-                <w:bCs/>
-                <w:sz w:val="24"/>
-                <w:szCs w:val="24"/>
-              </w:rPr>
-              <w:lastRenderedPageBreak/>
-              <w:t xml:space="preserve">6A, 6B, 6C day – 45min – August - Week </w:t>
-            </w:r>
-            <w:r>
-              <w:rPr>
-                <w:b/>
-                <w:bCs/>
-                <w:sz w:val="24"/>
-                <w:szCs w:val="24"/>
-              </w:rPr>
-              <w:t>1</w:t>
-            </w:r>
-            <w:r>
-              <w:rPr>
-                <w:b/>
-                <w:bCs/>
-                <w:sz w:val="24"/>
-                <w:szCs w:val="24"/>
-              </w:rPr>
-              <w:t>0</w:t>
+                <w:sz w:val="24"/>
+              </w:rPr>
+              <w:t>6A, 6B, 6C day – 45min – August - Week 11</w:t>
             </w:r>
           </w:p>
         </w:tc>
@@ -1284,30 +928,11 @@
             </w:pPr>
             <w:r>
               <w:rPr>
+                <w:rFonts w:ascii="Arial" w:hAnsi="Arial"/>
                 <w:b/>
-                <w:bCs/>
-                <w:sz w:val="24"/>
-                <w:szCs w:val="24"/>
-              </w:rPr>
-              <w:t xml:space="preserve">6A, 6B, 6C day – 90 min – August - Week </w:t>
-            </w:r>
-            <w:r>
-              <w:rPr>
-                <w:b/>
-                <w:bCs/>
-                <w:sz w:val="24"/>
-                <w:szCs w:val="24"/>
-              </w:rPr>
-              <w:t>1</w:t>
-            </w:r>
-            <w:r>
-              <w:rPr>
-                <w:b/>
-                <w:bCs/>
-                <w:sz w:val="24"/>
-                <w:szCs w:val="24"/>
-              </w:rPr>
-              <w:t>0</w:t>
+                <w:sz w:val="24"/>
+              </w:rPr>
+              <w:t>6A, 6B, 6C day – 90 min – August - Week 11</w:t>
             </w:r>
           </w:p>
         </w:tc>
@@ -1325,301 +950,126 @@
           </w:tcPr>
           <w:p>
             <w:pPr>
-              <w:spacing w:line="360" w:lineRule="auto"/>
+              <w:spacing w:line="240" w:lineRule="auto" w:before="0" w:after="0"/>
               <w:rPr>
                 <w:sz w:val="24"/>
                 <w:szCs w:val="24"/>
               </w:rPr>
             </w:pPr>
-          </w:p>
-          <w:p>
-            <w:pPr>
-              <w:spacing w:line="360" w:lineRule="auto"/>
-              <w:rPr>
-                <w:sz w:val="24"/>
-                <w:szCs w:val="24"/>
-              </w:rPr>
-            </w:pPr>
-            <w:r>
-              <w:rPr>
+            <w:r>
+              <w:rPr>
+                <w:rFonts w:ascii="Arial" w:hAnsi="Arial"/>
                 <w:b/>
-                <w:bCs/>
-                <w:sz w:val="24"/>
-                <w:szCs w:val="24"/>
-              </w:rPr>
-              <w:t>Topic</w:t>
-            </w:r>
-            <w:r>
-              <w:rPr>
-                <w:sz w:val="24"/>
-                <w:szCs w:val="24"/>
-              </w:rPr>
-              <w:t xml:space="preserve">: </w:t>
-            </w:r>
-            <w:r>
-              <w:rPr>
-                <w:sz w:val="24"/>
-                <w:szCs w:val="24"/>
-              </w:rPr>
-              <w:t xml:space="preserve">Make improvements to your </w:t>
-            </w:r>
-            <w:proofErr w:type="spellStart"/>
-            <w:r>
-              <w:rPr>
-                <w:sz w:val="24"/>
-                <w:szCs w:val="24"/>
-              </w:rPr>
-              <w:t>mBot</w:t>
-            </w:r>
-            <w:proofErr w:type="spellEnd"/>
-            <w:r>
-              <w:rPr>
-                <w:sz w:val="24"/>
-                <w:szCs w:val="24"/>
+                <w:sz w:val="24"/>
+              </w:rPr>
+              <w:t>Topic:</w:t>
+            </w:r>
+            <w:r>
+              <w:rPr>
+                <w:rFonts w:ascii="Arial" w:hAnsi="Arial"/>
+                <w:b w:val="0"/>
+                <w:sz w:val="24"/>
+              </w:rPr>
+              <w:t xml:space="preserve"> Rescue Robot final build and rehearsal</w:t>
+            </w:r>
+            <w:r>
+              <w:rPr>
+                <w:rFonts w:ascii="Arial" w:hAnsi="Arial"/>
+                <w:b/>
+                <w:sz w:val="24"/>
               </w:rPr>
               <w:br/>
-            </w:r>
-            <w:r>
-              <w:rPr>
-                <w:sz w:val="24"/>
-                <w:szCs w:val="24"/>
+              <w:t>Class Objective:</w:t>
+            </w:r>
+            <w:r>
+              <w:rPr>
+                <w:rFonts w:ascii="Arial" w:hAnsi="Arial"/>
+                <w:b w:val="0"/>
+                <w:sz w:val="24"/>
               </w:rPr>
               <w:br/>
-            </w:r>
-            <w:r>
-              <w:rPr>
-                <w:sz w:val="24"/>
-                <w:szCs w:val="24"/>
+              <w:t>Finish the assigned Rescue Robot logic and prepare the robot, explanation, and equipment checklist for presentation.</w:t>
+            </w:r>
+            <w:r>
+              <w:rPr>
+                <w:rFonts w:ascii="Arial" w:hAnsi="Arial"/>
                 <w:b/>
-                <w:bCs/>
-              </w:rPr>
-              <w:t>Class Objective:</w:t>
-            </w:r>
-            <w:r>
-              <w:rPr>
-                <w:sz w:val="24"/>
-                <w:szCs w:val="24"/>
+                <w:sz w:val="24"/>
               </w:rPr>
               <w:br/>
-              <w:t>Practice explaining what the robot should do.</w:t>
-            </w:r>
-            <w:r>
-              <w:rPr>
-                <w:sz w:val="24"/>
-                <w:szCs w:val="24"/>
+              <w:t>Pre-activities</w:t>
+            </w:r>
+            <w:r>
+              <w:rPr>
+                <w:rFonts w:ascii="Arial" w:hAnsi="Arial"/>
+                <w:b w:val="0"/>
+                <w:sz w:val="24"/>
               </w:rPr>
               <w:br/>
+              <w:t>Review August Week 2 and 3 vocabulary: obstacle, branch, blocked, open, rescue zone, demonstrate, explain, submit, and disconnect.</w:t>
+            </w:r>
+            <w:r>
+              <w:rPr>
+                <w:rFonts w:ascii="Arial" w:hAnsi="Arial"/>
+                <w:b w:val="0"/>
+                <w:sz w:val="24"/>
+              </w:rPr>
               <w:br/>
-            </w:r>
-            <w:r>
-              <w:rPr>
+              <w:t>Review the Summative #5 rubric and presentation order.</w:t>
+            </w:r>
+            <w:r>
+              <w:rPr>
+                <w:rFonts w:ascii="Arial" w:hAnsi="Arial"/>
                 <w:b/>
-                <w:bCs/>
-                <w:sz w:val="24"/>
-                <w:szCs w:val="24"/>
-              </w:rPr>
-              <w:t>Pre-activities</w:t>
-            </w:r>
-            <w:r>
-              <w:rPr>
-                <w:sz w:val="24"/>
-                <w:szCs w:val="24"/>
+                <w:sz w:val="24"/>
               </w:rPr>
               <w:br/>
-              <w:t xml:space="preserve">Answer the warm-up question: What </w:t>
-            </w:r>
-            <w:r>
-              <w:rPr>
-                <w:sz w:val="24"/>
-                <w:szCs w:val="24"/>
-              </w:rPr>
-              <w:t>could</w:t>
-            </w:r>
-            <w:r>
-              <w:rPr>
-                <w:sz w:val="24"/>
-                <w:szCs w:val="24"/>
-              </w:rPr>
-              <w:t xml:space="preserve"> you </w:t>
-            </w:r>
-            <w:r>
-              <w:rPr>
-                <w:sz w:val="24"/>
-                <w:szCs w:val="24"/>
-              </w:rPr>
-              <w:t xml:space="preserve">improve based on </w:t>
-            </w:r>
-            <w:r>
-              <w:rPr>
-                <w:sz w:val="24"/>
-                <w:szCs w:val="24"/>
-              </w:rPr>
-              <w:t xml:space="preserve">audience </w:t>
-            </w:r>
-            <w:r>
-              <w:rPr>
-                <w:sz w:val="24"/>
-                <w:szCs w:val="24"/>
-              </w:rPr>
-              <w:t>response</w:t>
-            </w:r>
-            <w:r>
-              <w:rPr>
-                <w:sz w:val="24"/>
-                <w:szCs w:val="24"/>
-              </w:rPr>
-              <w:t xml:space="preserve"> about your robot?</w:t>
-            </w:r>
-          </w:p>
-          <w:p>
-            <w:pPr>
-              <w:spacing w:line="360" w:lineRule="auto"/>
-              <w:rPr>
-                <w:sz w:val="24"/>
-                <w:szCs w:val="24"/>
-              </w:rPr>
-            </w:pPr>
-            <w:r>
-              <w:rPr>
-                <w:sz w:val="24"/>
-                <w:szCs w:val="24"/>
+              <w:t>While activities</w:t>
+            </w:r>
+            <w:r>
+              <w:rPr>
+                <w:rFonts w:ascii="Arial" w:hAnsi="Arial"/>
+                <w:b w:val="0"/>
+                <w:sz w:val="24"/>
               </w:rPr>
               <w:br/>
-              <w:t>Complete a vocabulary review activity using August Week 3 practice vocabulary.</w:t>
-            </w:r>
-            <w:r>
-              <w:rPr>
-                <w:sz w:val="24"/>
-                <w:szCs w:val="24"/>
+              <w:t>Complete the remaining front, left, and right checks and final stop condition in the assigned project.</w:t>
+            </w:r>
+            <w:r>
+              <w:rPr>
+                <w:rFonts w:ascii="Arial" w:hAnsi="Arial"/>
+                <w:b w:val="0"/>
+                <w:sz w:val="24"/>
               </w:rPr>
               <w:br/>
-              <w:t>challenge: task that takes effort</w:t>
-            </w:r>
-            <w:r>
-              <w:rPr>
-                <w:sz w:val="24"/>
-                <w:szCs w:val="24"/>
+              <w:t>Test the full route once and correct one problem.</w:t>
+            </w:r>
+            <w:r>
+              <w:rPr>
+                <w:rFonts w:ascii="Arial" w:hAnsi="Arial"/>
+                <w:b w:val="0"/>
+                <w:sz w:val="24"/>
               </w:rPr>
               <w:br/>
-              <w:t>test: try and check</w:t>
-            </w:r>
-            <w:r>
-              <w:rPr>
-                <w:sz w:val="24"/>
-                <w:szCs w:val="24"/>
+              <w:t>Rehearse the English explanation and complete the readiness and lab-care checklist.</w:t>
+            </w:r>
+            <w:r>
+              <w:rPr>
+                <w:rFonts w:ascii="Arial" w:hAnsi="Arial"/>
+                <w:b/>
+                <w:sz w:val="24"/>
               </w:rPr>
               <w:br/>
-              <w:t>debug: find and fix a problem</w:t>
-            </w:r>
-            <w:r>
-              <w:rPr>
-                <w:sz w:val="24"/>
-                <w:szCs w:val="24"/>
+              <w:t>Post activities</w:t>
+            </w:r>
+            <w:r>
+              <w:rPr>
+                <w:rFonts w:ascii="Arial" w:hAnsi="Arial"/>
+                <w:b w:val="0"/>
+                <w:sz w:val="24"/>
               </w:rPr>
               <w:br/>
-              <w:t>improve: make better</w:t>
-            </w:r>
-            <w:r>
-              <w:rPr>
-                <w:sz w:val="24"/>
-                <w:szCs w:val="24"/>
-              </w:rPr>
-              <w:br/>
-            </w:r>
-            <w:r>
-              <w:rPr>
-                <w:sz w:val="24"/>
-                <w:szCs w:val="24"/>
-              </w:rPr>
-              <w:br/>
-            </w:r>
-            <w:r>
-              <w:rPr>
-                <w:b/>
-                <w:bCs/>
-                <w:sz w:val="24"/>
-                <w:szCs w:val="24"/>
-              </w:rPr>
-              <w:t>While activities</w:t>
-            </w:r>
-            <w:r>
-              <w:rPr>
-                <w:sz w:val="24"/>
-                <w:szCs w:val="24"/>
-              </w:rPr>
-              <w:br/>
-              <w:t>Practice explaining what the robot should do.</w:t>
-            </w:r>
-            <w:r>
-              <w:rPr>
-                <w:sz w:val="24"/>
-                <w:szCs w:val="24"/>
-              </w:rPr>
-              <w:br/>
-              <w:t>Describe which card, block, or part helped your program.</w:t>
-            </w:r>
-            <w:r>
-              <w:rPr>
-                <w:sz w:val="24"/>
-                <w:szCs w:val="24"/>
-              </w:rPr>
-              <w:br/>
-              <w:t>Explain what you improved after testing.</w:t>
-            </w:r>
-            <w:r>
-              <w:rPr>
-                <w:sz w:val="24"/>
-                <w:szCs w:val="24"/>
-              </w:rPr>
-              <w:br/>
-            </w:r>
-            <w:r>
-              <w:rPr>
-                <w:sz w:val="24"/>
-                <w:szCs w:val="24"/>
-              </w:rPr>
-              <w:br/>
-            </w:r>
-            <w:r>
-              <w:rPr>
-                <w:b/>
-                <w:bCs/>
-                <w:sz w:val="24"/>
-                <w:szCs w:val="24"/>
-              </w:rPr>
-              <w:t>Post activities</w:t>
-            </w:r>
-            <w:r>
-              <w:rPr>
-                <w:sz w:val="24"/>
-                <w:szCs w:val="24"/>
-              </w:rPr>
-              <w:br/>
-              <w:t>Submit your explanation notes.</w:t>
-            </w:r>
-            <w:r>
-              <w:rPr>
-                <w:sz w:val="24"/>
-                <w:szCs w:val="24"/>
-              </w:rPr>
-              <w:br/>
-              <w:t xml:space="preserve">Prepare your final </w:t>
-            </w:r>
-            <w:proofErr w:type="spellStart"/>
-            <w:r>
-              <w:rPr>
-                <w:sz w:val="24"/>
-                <w:szCs w:val="24"/>
-              </w:rPr>
-              <w:t>mBot</w:t>
-            </w:r>
-            <w:proofErr w:type="spellEnd"/>
-            <w:r>
-              <w:rPr>
-                <w:sz w:val="24"/>
-                <w:szCs w:val="24"/>
-              </w:rPr>
-              <w:t xml:space="preserve"> demonstration.</w:t>
+              <w:t>Save the final project and confirm that the pair is ready to present during the 90-minute class.</w:t>
             </w:r>
           </w:p>
         </w:tc>
@@ -1635,7 +1085,7 @@
           </w:tcPr>
           <w:p>
             <w:pPr>
-              <w:spacing w:line="360" w:lineRule="auto"/>
+              <w:spacing w:line="240" w:lineRule="auto" w:before="0" w:after="0"/>
               <w:rPr>
                 <w:sz w:val="24"/>
                 <w:szCs w:val="24"/>
@@ -1643,309 +1093,101 @@
             </w:pPr>
             <w:r>
               <w:rPr>
+                <w:rFonts w:ascii="Arial" w:hAnsi="Arial"/>
                 <w:b/>
-                <w:bCs/>
-                <w:sz w:val="24"/>
-                <w:szCs w:val="24"/>
+                <w:sz w:val="24"/>
               </w:rPr>
               <w:t>Topic:</w:t>
             </w:r>
             <w:r>
               <w:rPr>
+                <w:rFonts w:ascii="Arial" w:hAnsi="Arial"/>
+                <w:b w:val="0"/>
+                <w:sz w:val="24"/>
+              </w:rPr>
+              <w:t xml:space="preserve"> Summative 5 - Rescue Robot presentations</w:t>
+            </w:r>
+            <w:r>
+              <w:rPr>
+                <w:rFonts w:ascii="Arial" w:hAnsi="Arial"/>
                 <w:b/>
-                <w:bCs/>
-                <w:sz w:val="24"/>
-                <w:szCs w:val="24"/>
-              </w:rPr>
-              <w:t xml:space="preserve"> </w:t>
-            </w:r>
-            <w:r>
-              <w:rPr>
-                <w:sz w:val="24"/>
-                <w:szCs w:val="24"/>
-              </w:rPr>
-              <w:t xml:space="preserve">Build and </w:t>
-            </w:r>
-            <w:r>
-              <w:rPr>
-                <w:sz w:val="24"/>
-                <w:szCs w:val="24"/>
-              </w:rPr>
-              <w:t>demonstrate</w:t>
-            </w:r>
-            <w:r>
-              <w:rPr>
-                <w:sz w:val="24"/>
-                <w:szCs w:val="24"/>
-              </w:rPr>
-              <w:t xml:space="preserve"> final challenge</w:t>
-            </w:r>
-            <w:r>
-              <w:rPr>
-                <w:sz w:val="24"/>
-                <w:szCs w:val="24"/>
+                <w:sz w:val="24"/>
               </w:rPr>
               <w:br/>
-            </w:r>
-            <w:r>
-              <w:rPr>
-                <w:sz w:val="24"/>
-                <w:szCs w:val="24"/>
+              <w:t>Class Objective:</w:t>
+            </w:r>
+            <w:r>
+              <w:rPr>
+                <w:rFonts w:ascii="Arial" w:hAnsi="Arial"/>
+                <w:b w:val="0"/>
+                <w:sz w:val="24"/>
               </w:rPr>
               <w:br/>
-            </w:r>
-            <w:r>
-              <w:rPr>
-                <w:sz w:val="24"/>
-                <w:szCs w:val="24"/>
+              <w:t>Present and demonstrate the teacher-assigned mBot Rescue Robot task.</w:t>
+            </w:r>
+            <w:r>
+              <w:rPr>
+                <w:rFonts w:ascii="Arial" w:hAnsi="Arial"/>
                 <w:b/>
-                <w:bCs/>
-              </w:rPr>
-              <w:t>Class Objective:</w:t>
-            </w:r>
-            <w:r>
-              <w:rPr>
-                <w:sz w:val="24"/>
-                <w:szCs w:val="24"/>
+                <w:sz w:val="24"/>
               </w:rPr>
               <w:br/>
-              <w:t>Program the final challenge using movement plus one output or sensor.</w:t>
-            </w:r>
-            <w:r>
-              <w:rPr>
-                <w:sz w:val="24"/>
-                <w:szCs w:val="24"/>
+              <w:t>Pre-activities</w:t>
+            </w:r>
+            <w:r>
+              <w:rPr>
+                <w:rFonts w:ascii="Arial" w:hAnsi="Arial"/>
+                <w:b w:val="0"/>
+                <w:sz w:val="24"/>
               </w:rPr>
               <w:br/>
+              <w:t>Collect the numbered kit, open the final assigned project, prepare the route, and confirm partner roles and presentation order.</w:t>
+            </w:r>
+            <w:r>
+              <w:rPr>
+                <w:rFonts w:ascii="Arial" w:hAnsi="Arial"/>
+                <w:b/>
+                <w:sz w:val="24"/>
+              </w:rPr>
               <w:br/>
-            </w:r>
-            <w:r>
-              <w:rPr>
+              <w:t>While activities</w:t>
+            </w:r>
+            <w:r>
+              <w:rPr>
+                <w:rFonts w:ascii="Arial" w:hAnsi="Arial"/>
+                <w:b w:val="0"/>
+                <w:sz w:val="24"/>
+                <w:highlight w:val="yellow"/>
+              </w:rPr>
+              <w:br/>
+              <w:t>Complete Summative Activity #5: With a partner, present and demonstrate the Rescue Robot; show that it follows the line, detects blocked paths, turns onto an open branch, and stops when the front, left, and right are blocked; save and submit the project; explain its behavior in English; and follow all equipment procedures.</w:t>
+            </w:r>
+            <w:r>
+              <w:rPr>
+                <w:rFonts w:ascii="Arial" w:hAnsi="Arial"/>
                 <w:b/>
-                <w:bCs/>
-                <w:sz w:val="24"/>
-                <w:szCs w:val="24"/>
-              </w:rPr>
-              <w:t>Pre-activities</w:t>
-            </w:r>
-            <w:r>
-              <w:rPr>
-                <w:sz w:val="24"/>
-                <w:szCs w:val="24"/>
+                <w:sz w:val="24"/>
               </w:rPr>
               <w:br/>
-              <w:t>Review your challenge plan and success rule.</w:t>
-            </w:r>
-            <w:r>
-              <w:rPr>
-                <w:sz w:val="24"/>
-                <w:szCs w:val="24"/>
+              <w:t>Post activities</w:t>
+            </w:r>
+            <w:r>
+              <w:rPr>
+                <w:rFonts w:ascii="Arial" w:hAnsi="Arial"/>
+                <w:b w:val="0"/>
+                <w:sz w:val="24"/>
               </w:rPr>
               <w:br/>
-              <w:t>Prepare the mBot, cards, and test area.</w:t>
-            </w:r>
-          </w:p>
-          <w:p>
-            <w:pPr>
-              <w:spacing w:line="360" w:lineRule="auto"/>
-              <w:rPr>
-                <w:sz w:val="24"/>
-                <w:szCs w:val="24"/>
-              </w:rPr>
-            </w:pPr>
-            <w:r>
-              <w:rPr>
-                <w:sz w:val="24"/>
-                <w:szCs w:val="24"/>
+              <w:t>Submit the saved project.</w:t>
+            </w:r>
+            <w:r>
+              <w:rPr>
+                <w:rFonts w:ascii="Arial" w:hAnsi="Arial"/>
+                <w:b w:val="0"/>
+                <w:sz w:val="24"/>
               </w:rPr>
               <w:br/>
-            </w:r>
-            <w:r>
-              <w:rPr>
-                <w:sz w:val="24"/>
-                <w:szCs w:val="24"/>
-              </w:rPr>
-              <w:t>Review August Week 2 practice vocabulary.</w:t>
-            </w:r>
-            <w:r>
-              <w:rPr>
-                <w:sz w:val="24"/>
-                <w:szCs w:val="24"/>
-              </w:rPr>
-              <w:br/>
-            </w:r>
-            <w:r>
-              <w:rPr>
-                <w:sz w:val="24"/>
-                <w:szCs w:val="24"/>
-              </w:rPr>
-              <w:br/>
-              <w:t>improvement: change that makes better</w:t>
-            </w:r>
-            <w:r>
-              <w:rPr>
-                <w:sz w:val="24"/>
-                <w:szCs w:val="24"/>
-              </w:rPr>
-              <w:br/>
-              <w:t>challenge: task that takes effort</w:t>
-            </w:r>
-            <w:r>
-              <w:rPr>
-                <w:sz w:val="24"/>
-                <w:szCs w:val="24"/>
-              </w:rPr>
-              <w:br/>
-              <w:t>parts: pieces of a device</w:t>
-            </w:r>
-          </w:p>
-          <w:p>
-            <w:pPr>
-              <w:spacing w:line="360" w:lineRule="auto"/>
-              <w:rPr>
-                <w:sz w:val="24"/>
-                <w:szCs w:val="24"/>
-                <w:highlight w:val="yellow"/>
-              </w:rPr>
-            </w:pPr>
-            <w:r>
-              <w:rPr>
-                <w:sz w:val="24"/>
-                <w:szCs w:val="24"/>
-              </w:rPr>
-              <w:br/>
-            </w:r>
-            <w:r>
-              <w:rPr>
-                <w:b/>
-                <w:bCs/>
-                <w:sz w:val="24"/>
-                <w:szCs w:val="24"/>
-              </w:rPr>
-              <w:t>While activities</w:t>
-            </w:r>
-            <w:r>
-              <w:rPr>
-                <w:sz w:val="24"/>
-                <w:szCs w:val="24"/>
-              </w:rPr>
-              <w:br/>
-            </w:r>
-            <w:r>
-              <w:rPr>
-                <w:b/>
-                <w:bCs/>
-                <w:sz w:val="24"/>
-                <w:szCs w:val="24"/>
-                <w:highlight w:val="yellow"/>
-              </w:rPr>
-              <w:t>Complete Summative Activity #5:</w:t>
-            </w:r>
-            <w:r>
-              <w:rPr>
-                <w:sz w:val="24"/>
-                <w:szCs w:val="24"/>
-                <w:highlight w:val="yellow"/>
-              </w:rPr>
-              <w:t xml:space="preserve"> </w:t>
-            </w:r>
-            <w:r>
-              <w:rPr>
-                <w:sz w:val="24"/>
-                <w:szCs w:val="24"/>
-                <w:highlight w:val="yellow"/>
-              </w:rPr>
-              <w:t>Program the final challenge using movement plus one output or sensor.</w:t>
-            </w:r>
-          </w:p>
-          <w:p>
-            <w:pPr>
-              <w:spacing w:line="360" w:lineRule="auto"/>
-              <w:rPr>
-                <w:sz w:val="24"/>
-                <w:szCs w:val="24"/>
-              </w:rPr>
-            </w:pPr>
-            <w:r>
-              <w:rPr>
-                <w:sz w:val="24"/>
-                <w:szCs w:val="24"/>
-                <w:highlight w:val="yellow"/>
-              </w:rPr>
-              <w:t xml:space="preserve">Demonstrate your </w:t>
-            </w:r>
-            <w:proofErr w:type="spellStart"/>
-            <w:r>
-              <w:rPr>
-                <w:sz w:val="24"/>
-                <w:szCs w:val="24"/>
-                <w:highlight w:val="yellow"/>
-              </w:rPr>
-              <w:t>mBot</w:t>
-            </w:r>
-            <w:proofErr w:type="spellEnd"/>
-            <w:r>
-              <w:rPr>
-                <w:sz w:val="24"/>
-                <w:szCs w:val="24"/>
-                <w:highlight w:val="yellow"/>
-              </w:rPr>
-              <w:t xml:space="preserve"> STEM Challenge Project.</w:t>
-            </w:r>
-            <w:r>
-              <w:rPr>
-                <w:sz w:val="24"/>
-                <w:szCs w:val="24"/>
-              </w:rPr>
-              <w:br/>
-              <w:t>Debug one problem before asking for feedback.</w:t>
-            </w:r>
-            <w:r>
-              <w:rPr>
-                <w:sz w:val="24"/>
-                <w:szCs w:val="24"/>
-              </w:rPr>
-              <w:br/>
-              <w:t>Improve the program after testing.</w:t>
-            </w:r>
-            <w:r>
-              <w:rPr>
-                <w:sz w:val="24"/>
-                <w:szCs w:val="24"/>
-              </w:rPr>
-              <w:br/>
-            </w:r>
-            <w:r>
-              <w:rPr>
-                <w:sz w:val="24"/>
-                <w:szCs w:val="24"/>
-              </w:rPr>
-              <w:br/>
-            </w:r>
-            <w:r>
-              <w:rPr>
-                <w:b/>
-                <w:bCs/>
-                <w:sz w:val="24"/>
-                <w:szCs w:val="24"/>
-              </w:rPr>
-              <w:t>Post activities</w:t>
-            </w:r>
-            <w:r>
-              <w:rPr>
-                <w:sz w:val="24"/>
-                <w:szCs w:val="24"/>
-              </w:rPr>
-              <w:br/>
-              <w:t>Show your progress for a quick check.</w:t>
-            </w:r>
-            <w:r>
-              <w:rPr>
-                <w:sz w:val="24"/>
-                <w:szCs w:val="24"/>
-              </w:rPr>
-              <w:br/>
-              <w:t>Record one problem and one improvement.</w:t>
+              <w:t>Complete the presentation, route demonstration, English explanation, and equipment return check.</w:t>
             </w:r>
           </w:p>
         </w:tc>
@@ -2078,31 +1320,11 @@
             </w:pPr>
             <w:r>
               <w:rPr>
+                <w:rFonts w:ascii="Arial" w:hAnsi="Arial"/>
                 <w:b/>
-                <w:bCs/>
-                <w:sz w:val="24"/>
-                <w:szCs w:val="24"/>
-              </w:rPr>
-              <w:lastRenderedPageBreak/>
-              <w:t xml:space="preserve">6A, 6B, 6C day – 45min – August - Week </w:t>
-            </w:r>
-            <w:r>
-              <w:rPr>
-                <w:b/>
-                <w:bCs/>
-                <w:sz w:val="24"/>
-                <w:szCs w:val="24"/>
-              </w:rPr>
-              <w:t>1</w:t>
-            </w:r>
-            <w:r>
-              <w:rPr>
-                <w:b/>
-                <w:bCs/>
-                <w:sz w:val="24"/>
-                <w:szCs w:val="24"/>
-              </w:rPr>
-              <w:t>1</w:t>
+                <w:sz w:val="24"/>
+              </w:rPr>
+              <w:t>6A, 6B, 6C day – 45min – August - Week 12</w:t>
             </w:r>
           </w:p>
         </w:tc>
@@ -2129,30 +1351,11 @@
             </w:pPr>
             <w:r>
               <w:rPr>
+                <w:rFonts w:ascii="Arial" w:hAnsi="Arial"/>
                 <w:b/>
-                <w:bCs/>
-                <w:sz w:val="24"/>
-                <w:szCs w:val="24"/>
-              </w:rPr>
-              <w:t xml:space="preserve">6A, 6B, 6C day – 90 min – August - Week </w:t>
-            </w:r>
-            <w:r>
-              <w:rPr>
-                <w:b/>
-                <w:bCs/>
-                <w:sz w:val="24"/>
-                <w:szCs w:val="24"/>
-              </w:rPr>
-              <w:t>1</w:t>
-            </w:r>
-            <w:r>
-              <w:rPr>
-                <w:b/>
-                <w:bCs/>
-                <w:sz w:val="24"/>
-                <w:szCs w:val="24"/>
-              </w:rPr>
-              <w:t>1</w:t>
+                <w:sz w:val="24"/>
+              </w:rPr>
+              <w:t>6A, 6B, 6C day – 90 min – August - Week 12</w:t>
             </w:r>
           </w:p>
         </w:tc>
@@ -2170,7 +1373,7 @@
           </w:tcPr>
           <w:p>
             <w:pPr>
-              <w:spacing w:line="360" w:lineRule="auto"/>
+              <w:spacing w:line="240" w:lineRule="auto" w:before="0" w:after="0"/>
               <w:rPr>
                 <w:sz w:val="24"/>
                 <w:szCs w:val="24"/>
@@ -2178,251 +1381,101 @@
             </w:pPr>
             <w:r>
               <w:rPr>
+                <w:rFonts w:ascii="Arial" w:hAnsi="Arial"/>
                 <w:b/>
-                <w:bCs/>
-                <w:sz w:val="24"/>
-                <w:szCs w:val="24"/>
-              </w:rPr>
-              <w:t xml:space="preserve">Topic: </w:t>
-            </w:r>
-            <w:r>
-              <w:rPr>
-                <w:sz w:val="24"/>
-                <w:szCs w:val="24"/>
-              </w:rPr>
-              <w:t xml:space="preserve">Review, reflect, and leave </w:t>
-            </w:r>
-            <w:proofErr w:type="spellStart"/>
-            <w:r>
-              <w:rPr>
-                <w:sz w:val="24"/>
-                <w:szCs w:val="24"/>
-              </w:rPr>
-              <w:t>mBots</w:t>
-            </w:r>
-            <w:proofErr w:type="spellEnd"/>
-            <w:r>
-              <w:rPr>
-                <w:sz w:val="24"/>
-                <w:szCs w:val="24"/>
-              </w:rPr>
-              <w:t xml:space="preserve"> ready</w:t>
-            </w:r>
-            <w:r>
-              <w:rPr>
+                <w:sz w:val="24"/>
+              </w:rPr>
+              <w:t>Topic:</w:t>
+            </w:r>
+            <w:r>
+              <w:rPr>
+                <w:rFonts w:ascii="Arial" w:hAnsi="Arial"/>
+                <w:b w:val="0"/>
+                <w:sz w:val="24"/>
+              </w:rPr>
+              <w:t xml:space="preserve"> Formative Rescue Robot reflection and feedback</w:t>
+            </w:r>
+            <w:r>
+              <w:rPr>
+                <w:rFonts w:ascii="Arial" w:hAnsi="Arial"/>
                 <w:b/>
-                <w:bCs/>
-                <w:sz w:val="24"/>
-                <w:szCs w:val="24"/>
+                <w:sz w:val="24"/>
               </w:rPr>
               <w:br/>
-            </w:r>
-            <w:r>
-              <w:rPr>
-                <w:sz w:val="24"/>
-                <w:szCs w:val="24"/>
+              <w:t>Class Objective:</w:t>
+            </w:r>
+            <w:r>
+              <w:rPr>
+                <w:rFonts w:ascii="Arial" w:hAnsi="Arial"/>
+                <w:b w:val="0"/>
+                <w:sz w:val="24"/>
+              </w:rPr>
+              <w:br/>
+              <w:t>Reflect on the Rescue Robot presentation and identify one successful decision and one possible improvement.</w:t>
+            </w:r>
+            <w:r>
+              <w:rPr>
+                <w:rFonts w:ascii="Arial" w:hAnsi="Arial"/>
                 <w:b/>
-                <w:bCs/>
-              </w:rPr>
-              <w:t>Class Objective:</w:t>
-            </w:r>
-            <w:r>
-              <w:rPr>
-                <w:sz w:val="24"/>
-                <w:szCs w:val="24"/>
-              </w:rPr>
-              <w:br/>
-              <w:t>Explain the goal, route/behavior, main robot action, output or sensor, test result, and one improvement.</w:t>
-            </w:r>
-            <w:r>
-              <w:rPr>
-                <w:sz w:val="24"/>
-                <w:szCs w:val="24"/>
-              </w:rPr>
-              <w:br/>
-              <w:br/>
-            </w:r>
-            <w:r>
-              <w:rPr>
-                <w:b/>
-                <w:bCs/>
-                <w:sz w:val="24"/>
-                <w:szCs w:val="24"/>
+                <w:sz w:val="24"/>
               </w:rPr>
               <w:br/>
               <w:t>Pre-activities</w:t>
             </w:r>
             <w:r>
               <w:rPr>
+                <w:rFonts w:ascii="Arial" w:hAnsi="Arial"/>
+                <w:b w:val="0"/>
+                <w:sz w:val="24"/>
+              </w:rPr>
+              <w:br/>
+              <w:t>Review the presentation experience and August vocabulary: test, debug, improve, explain, and demonstrate.</w:t>
+            </w:r>
+            <w:r>
+              <w:rPr>
+                <w:rFonts w:ascii="Arial" w:hAnsi="Arial"/>
                 <w:b/>
-                <w:bCs/>
-                <w:sz w:val="24"/>
-                <w:szCs w:val="24"/>
-              </w:rPr>
-              <w:br/>
-            </w:r>
-            <w:r>
-              <w:rPr>
-                <w:sz w:val="24"/>
-                <w:szCs w:val="24"/>
-              </w:rPr>
-              <w:t>Review your demonstration notes.</w:t>
-            </w:r>
-            <w:r>
-              <w:rPr>
-                <w:sz w:val="24"/>
-                <w:szCs w:val="24"/>
-              </w:rPr>
-              <w:br/>
-              <w:t xml:space="preserve">Prepare the </w:t>
-            </w:r>
-            <w:proofErr w:type="spellStart"/>
-            <w:r>
-              <w:rPr>
-                <w:sz w:val="24"/>
-                <w:szCs w:val="24"/>
-              </w:rPr>
-              <w:t>mBot</w:t>
-            </w:r>
-            <w:proofErr w:type="spellEnd"/>
-            <w:r>
-              <w:rPr>
-                <w:sz w:val="24"/>
-                <w:szCs w:val="24"/>
-              </w:rPr>
-              <w:t xml:space="preserve"> and test area.</w:t>
-            </w:r>
-            <w:r>
-              <w:rPr>
-                <w:sz w:val="24"/>
-                <w:szCs w:val="24"/>
-              </w:rPr>
-              <w:br/>
-              <w:t>Complete a vocabulary review activity using August Week 3 practice vocabulary.</w:t>
-            </w:r>
-            <w:r>
-              <w:rPr>
-                <w:sz w:val="24"/>
-                <w:szCs w:val="24"/>
-              </w:rPr>
-              <w:br/>
-              <w:t>audience: people who see or hear work</w:t>
-            </w:r>
-            <w:r>
-              <w:rPr>
-                <w:sz w:val="24"/>
-                <w:szCs w:val="24"/>
-              </w:rPr>
-              <w:br/>
-              <w:t>explain: make clear with words</w:t>
-            </w:r>
-            <w:r>
-              <w:rPr>
-                <w:sz w:val="24"/>
-                <w:szCs w:val="24"/>
-              </w:rPr>
-              <w:br/>
-              <w:t>reflection: thinking about what worked</w:t>
-            </w:r>
-            <w:r>
-              <w:rPr>
-                <w:sz w:val="24"/>
-                <w:szCs w:val="24"/>
-              </w:rPr>
-              <w:br/>
-            </w:r>
-            <w:r>
-              <w:rPr>
-                <w:b/>
-                <w:bCs/>
-                <w:sz w:val="24"/>
-                <w:szCs w:val="24"/>
+                <w:sz w:val="24"/>
               </w:rPr>
               <w:br/>
               <w:t>While activities</w:t>
             </w:r>
             <w:r>
               <w:rPr>
+                <w:rFonts w:ascii="Arial" w:hAnsi="Arial"/>
+                <w:b w:val="0"/>
+                <w:sz w:val="24"/>
+              </w:rPr>
+              <w:br/>
+              <w:t>Complete a formative reflection describing one successful robot behavior, one challenge, one debugging step, and one improvement.</w:t>
+            </w:r>
+            <w:r>
+              <w:rPr>
+                <w:rFonts w:ascii="Arial" w:hAnsi="Arial"/>
+                <w:b w:val="0"/>
+                <w:sz w:val="24"/>
+              </w:rPr>
+              <w:br/>
+              <w:t>Give one constructive feedback comment to another pair.</w:t>
+            </w:r>
+            <w:r>
+              <w:rPr>
+                <w:rFonts w:ascii="Arial" w:hAnsi="Arial"/>
                 <w:b/>
-                <w:bCs/>
-                <w:sz w:val="24"/>
-                <w:szCs w:val="24"/>
-              </w:rPr>
-              <w:br/>
-            </w:r>
-            <w:r>
-              <w:rPr>
-                <w:sz w:val="24"/>
-                <w:szCs w:val="24"/>
-              </w:rPr>
-              <w:t>Explain the goal, route/behavior, main robot action, output or sensor, test result, and one improvement.</w:t>
-            </w:r>
-            <w:r>
-              <w:rPr>
-                <w:sz w:val="24"/>
-                <w:szCs w:val="24"/>
-              </w:rPr>
-              <w:br/>
-              <w:t>Save code or screenshot evidence.</w:t>
-            </w:r>
-            <w:r>
-              <w:rPr>
-                <w:sz w:val="24"/>
-                <w:szCs w:val="24"/>
-              </w:rPr>
-              <w:br/>
-              <w:t>Complete the readiness checklist: numbered kit, charged battery, challenge sheet, route/test data, and sensor/output notes.</w:t>
-            </w:r>
-            <w:r>
-              <w:rPr>
-                <w:sz w:val="24"/>
-                <w:szCs w:val="24"/>
-              </w:rPr>
-              <w:br/>
-            </w:r>
-            <w:r>
-              <w:rPr>
-                <w:b/>
-                <w:bCs/>
-                <w:sz w:val="24"/>
-                <w:szCs w:val="24"/>
+                <w:sz w:val="24"/>
               </w:rPr>
               <w:br/>
               <w:t>Post activities</w:t>
             </w:r>
             <w:r>
               <w:rPr>
-                <w:b/>
-                <w:bCs/>
-                <w:sz w:val="24"/>
-                <w:szCs w:val="24"/>
+                <w:rFonts w:ascii="Arial" w:hAnsi="Arial"/>
+                <w:b w:val="0"/>
+                <w:sz w:val="24"/>
               </w:rPr>
               <w:br/>
-            </w:r>
-            <w:r>
-              <w:rPr>
-                <w:sz w:val="24"/>
-                <w:szCs w:val="24"/>
-              </w:rPr>
-              <w:t>Complete the final robotics reflection.</w:t>
-            </w:r>
-            <w:r>
-              <w:rPr>
-                <w:sz w:val="24"/>
-                <w:szCs w:val="24"/>
-              </w:rPr>
-              <w:br/>
-              <w:t>Submit the reflection, project evidence, and readiness checklist.</w:t>
-            </w:r>
-          </w:p>
-          <w:p>
-            <w:pPr>
-              <w:spacing w:line="360" w:lineRule="auto"/>
-              <w:rPr>
-                <w:sz w:val="24"/>
-                <w:szCs w:val="24"/>
-              </w:rPr>
-            </w:pPr>
+              <w:t>Share one lesson learned from the Rescue Robot task.</w:t>
+            </w:r>
           </w:p>
         </w:tc>
         <w:tc>
@@ -2437,12 +1490,118 @@
           </w:tcPr>
           <w:p>
             <w:pPr>
-              <w:spacing w:line="360" w:lineRule="auto"/>
+              <w:spacing w:line="240" w:lineRule="auto" w:before="0" w:after="0"/>
               <w:rPr>
                 <w:sz w:val="24"/>
                 <w:szCs w:val="24"/>
               </w:rPr>
             </w:pPr>
+            <w:r>
+              <w:rPr>
+                <w:rFonts w:ascii="Arial" w:hAnsi="Arial"/>
+                <w:b/>
+                <w:sz w:val="24"/>
+              </w:rPr>
+              <w:t>Topic:</w:t>
+            </w:r>
+            <w:r>
+              <w:rPr>
+                <w:rFonts w:ascii="Arial" w:hAnsi="Arial"/>
+                <w:b w:val="0"/>
+                <w:sz w:val="24"/>
+              </w:rPr>
+              <w:t xml:space="preserve"> Formative robotics review and equipment readiness</w:t>
+            </w:r>
+            <w:r>
+              <w:rPr>
+                <w:rFonts w:ascii="Arial" w:hAnsi="Arial"/>
+                <w:b/>
+                <w:sz w:val="24"/>
+              </w:rPr>
+              <w:br/>
+              <w:t>Class Objective:</w:t>
+            </w:r>
+            <w:r>
+              <w:rPr>
+                <w:rFonts w:ascii="Arial" w:hAnsi="Arial"/>
+                <w:b w:val="0"/>
+                <w:sz w:val="24"/>
+              </w:rPr>
+              <w:br/>
+              <w:t>Review the main mBot skills from the trimester and prepare the numbered kits for the next unit.</w:t>
+            </w:r>
+            <w:r>
+              <w:rPr>
+                <w:rFonts w:ascii="Arial" w:hAnsi="Arial"/>
+                <w:b/>
+                <w:sz w:val="24"/>
+              </w:rPr>
+              <w:br/>
+              <w:t>Pre-activities</w:t>
+            </w:r>
+            <w:r>
+              <w:rPr>
+                <w:rFonts w:ascii="Arial" w:hAnsi="Arial"/>
+                <w:b w:val="0"/>
+                <w:sz w:val="24"/>
+              </w:rPr>
+              <w:br/>
+              <w:t>Complete a formative matching review of movement, line sensor, ultrasonic sensor, loop, condition, branch, and debugging vocabulary.</w:t>
+            </w:r>
+            <w:r>
+              <w:rPr>
+                <w:rFonts w:ascii="Arial" w:hAnsi="Arial"/>
+                <w:b/>
+                <w:sz w:val="24"/>
+              </w:rPr>
+              <w:br/>
+              <w:t>While activities</w:t>
+            </w:r>
+            <w:r>
+              <w:rPr>
+                <w:rFonts w:ascii="Arial" w:hAnsi="Arial"/>
+                <w:b w:val="0"/>
+                <w:sz w:val="24"/>
+              </w:rPr>
+              <w:br/>
+              <w:t>Rotate through guided review stations for line-following logic, ultrasonic conditions, flowchart reading, and code debugging.</w:t>
+            </w:r>
+            <w:r>
+              <w:rPr>
+                <w:rFonts w:ascii="Arial" w:hAnsi="Arial"/>
+                <w:b w:val="0"/>
+                <w:sz w:val="24"/>
+              </w:rPr>
+              <w:br/>
+              <w:t>Complete the numbered-kit readiness check and organize all robot parts.</w:t>
+            </w:r>
+            <w:r>
+              <w:rPr>
+                <w:rFonts w:ascii="Arial" w:hAnsi="Arial"/>
+                <w:b w:val="0"/>
+                <w:sz w:val="24"/>
+              </w:rPr>
+              <w:br/>
+              <w:t>This activity is formative and does not create an additional grade.</w:t>
+            </w:r>
+            <w:r>
+              <w:rPr>
+                <w:rFonts w:ascii="Arial" w:hAnsi="Arial"/>
+                <w:b/>
+                <w:sz w:val="24"/>
+              </w:rPr>
+              <w:br/>
+              <w:t>Post activities</w:t>
+            </w:r>
+            <w:r>
+              <w:rPr>
+                <w:rFonts w:ascii="Arial" w:hAnsi="Arial"/>
+                <w:b w:val="0"/>
+                <w:sz w:val="24"/>
+              </w:rPr>
+              <w:br/>
+              <w:t>Submit the review sheet and confirm that the assigned kit is complete and correctly stored.</w:t>
+            </w:r>
           </w:p>
         </w:tc>
       </w:tr>

</xml_diff>